<commit_message>
Add Astro web framework to skills
</commit_message>
<xml_diff>
--- a/Brigham_Pettit_Resume.docx
+++ b/Brigham_Pettit_Resume.docx
@@ -6,55 +6,10 @@
       <w:pPr>
         <w:pStyle w:val="Normal"/>
         <w:widowControl w:val="false"/>
-        <w:pBdr/>
         <w:spacing w:lineRule="auto" w:line="276"/>
         <w:jc w:val="center"/>
         <w:rPr/>
       </w:pPr>
-      <w:r>
-        <w:pict>
-          <v:shapetype id="_x0000_t136" coordsize="21600,21600" o:spt="136" adj="10800" path="m@9,l@10,em@11,21600l@12,21600e">
-            <v:stroke joinstyle="miter"/>
-            <v:formulas>
-              <v:f eqn="val #0"/>
-              <v:f eqn="sum @0 0 10800"/>
-              <v:f eqn="sum @0 0 0"/>
-              <v:f eqn="sum width 0 @0"/>
-              <v:f eqn="prod @2 2 1"/>
-              <v:f eqn="prod @3 2 1"/>
-              <v:f eqn="if @1 @5 @4"/>
-              <v:f eqn="sum 0 @6 0"/>
-              <v:f eqn="sum width 0 @6"/>
-              <v:f eqn="if @1 0 @8"/>
-              <v:f eqn="if @1 @7 width"/>
-              <v:f eqn="if @1 @8 0"/>
-              <v:f eqn="if @1 width @7"/>
-            </v:formulas>
-            <v:handles>
-              <v:h position="@0,21600"/>
-            </v:handles>
-          </v:shapetype>
-          <v:shape id="shape_0" adj="10800" fillcolor="white" stroked="t" o:allowincell="f" style="position:absolute;margin-left:0.05pt;margin-top:0pt;width:49.95pt;height:49.95pt;mso-wrap-style:none;v-text-anchor:middle" type="_x0000_t136">
-            <v:fill o:detectmouseclick="t" type="solid" color2="black"/>
-            <v:stroke color="black" joinstyle="round" endcap="flat"/>
-            <w10:wrap type="none"/>
-          </v:shape>
-        </w:pict>
-        <w:pict>
-          <v:shape id="shape_0" adj="10800" fillcolor="white" stroked="t" o:allowincell="f" style="position:absolute;margin-left:0.05pt;margin-top:0pt;width:49.95pt;height:49.95pt;mso-wrap-style:none;v-text-anchor:middle" type="_x0000_t136">
-            <v:fill o:detectmouseclick="t" type="solid" color2="black"/>
-            <v:stroke color="black" joinstyle="round" endcap="flat"/>
-            <w10:wrap type="none"/>
-          </v:shape>
-        </w:pict>
-        <w:pict>
-          <v:shape id="shape_0" adj="10800" fillcolor="white" stroked="t" o:allowincell="f" style="position:absolute;margin-left:0.05pt;margin-top:0pt;width:49.95pt;height:49.95pt;mso-wrap-style:none;v-text-anchor:middle" type="_x0000_t136">
-            <v:fill o:detectmouseclick="t" type="solid" color2="black"/>
-            <v:stroke color="black" joinstyle="round" endcap="flat"/>
-            <w10:wrap type="none"/>
-          </v:shape>
-        </w:pict>
-      </w:r>
       <w:r>
         <w:rPr>
           <w:b/>
@@ -130,34 +85,7 @@
             <w:sz w:val="20"/>
             <w:szCs w:val="20"/>
           </w:rPr>
-          <w:t>www.linkedin.com/in/b</w:t>
-        </w:r>
-        <w:r>
-          <w:rPr>
-            <w:rStyle w:val="Style3"/>
-            <w:color w:val="0563C1"/>
-            <w:sz w:val="20"/>
-            <w:szCs w:val="20"/>
-          </w:rPr>
-          <w:t>r</w:t>
-        </w:r>
-        <w:r>
-          <w:rPr>
-            <w:rStyle w:val="Style3"/>
-            <w:color w:val="0563C1"/>
-            <w:sz w:val="20"/>
-            <w:szCs w:val="20"/>
-          </w:rPr>
-          <w:t>igham-</w:t>
-        </w:r>
-        <w:r>
-          <w:rPr>
-            <w:rStyle w:val="Style3"/>
-            <w:color w:val="0563C1"/>
-            <w:sz w:val="20"/>
-            <w:szCs w:val="20"/>
-          </w:rPr>
-          <w:t>pettit</w:t>
+          <w:t>www.linkedin.com/in/brigham-pettit</w:t>
         </w:r>
       </w:hyperlink>
       <w:r>
@@ -383,7 +311,7 @@
         </w:rPr>
         <w:t>Frameworks:</w:t>
         <w:tab/>
-        <w:t>React, Angular, Ruby on Rails, Vue</w:t>
+        <w:t>React, Angular, Ruby on Rails, Vue, Astro</w:t>
       </w:r>
     </w:p>
     <w:p>
@@ -594,7 +522,6 @@
           <w:ilvl w:val="0"/>
           <w:numId w:val="2"/>
         </w:numPr>
-        <w:pBdr/>
         <w:jc w:val="both"/>
         <w:rPr>
           <w:color w:val="000000"/>
@@ -616,7 +543,6 @@
           <w:ilvl w:val="0"/>
           <w:numId w:val="2"/>
         </w:numPr>
-        <w:pBdr/>
         <w:jc w:val="both"/>
         <w:rPr>
           <w:color w:val="000000"/>
@@ -638,7 +564,6 @@
           <w:ilvl w:val="0"/>
           <w:numId w:val="2"/>
         </w:numPr>
-        <w:pBdr/>
         <w:jc w:val="both"/>
         <w:rPr>
           <w:color w:val="000000"/>
@@ -740,7 +665,6 @@
           <w:ilvl w:val="0"/>
           <w:numId w:val="1"/>
         </w:numPr>
-        <w:pBdr/>
         <w:jc w:val="both"/>
         <w:rPr>
           <w:color w:val="000000"/>
@@ -762,7 +686,6 @@
           <w:ilvl w:val="0"/>
           <w:numId w:val="1"/>
         </w:numPr>
-        <w:pBdr/>
         <w:jc w:val="both"/>
         <w:rPr>
           <w:color w:val="000000"/>
@@ -864,7 +787,6 @@
           <w:ilvl w:val="0"/>
           <w:numId w:val="3"/>
         </w:numPr>
-        <w:pBdr/>
         <w:rPr>
           <w:color w:val="000000"/>
           <w:sz w:val="20"/>
@@ -907,7 +829,6 @@
           <w:ilvl w:val="0"/>
           <w:numId w:val="3"/>
         </w:numPr>
-        <w:pBdr/>
         <w:rPr>
           <w:color w:val="000000"/>
           <w:sz w:val="20"/>
@@ -1230,7 +1151,6 @@
   <w:p>
     <w:pPr>
       <w:pStyle w:val="Normal"/>
-      <w:pBdr/>
       <w:tabs>
         <w:tab w:val="clear" w:pos="720"/>
         <w:tab w:val="center" w:pos="4680" w:leader="none"/>
@@ -1250,7 +1170,6 @@
   <w:p>
     <w:pPr>
       <w:pStyle w:val="Normal"/>
-      <w:pBdr/>
       <w:tabs>
         <w:tab w:val="clear" w:pos="720"/>
         <w:tab w:val="center" w:pos="4680" w:leader="none"/>
@@ -1295,7 +1214,6 @@
   <w:p>
     <w:pPr>
       <w:pStyle w:val="Normal"/>
-      <w:pBdr/>
       <w:tabs>
         <w:tab w:val="clear" w:pos="720"/>
         <w:tab w:val="center" w:pos="4680" w:leader="none"/>
@@ -1313,7 +1231,7 @@
       <mc:AlternateContent>
         <mc:Choice Requires="wps">
           <w:drawing>
-            <wp:anchor distT="0" distB="0" distL="0" distR="0" simplePos="0" relativeHeight="2" behindDoc="1" locked="0" layoutInCell="0" allowOverlap="1" wp14:anchorId="6D33703B">
+            <wp:anchor distT="1418590" distB="1418590" distL="1419225" distR="1417955" simplePos="0" relativeHeight="2" behindDoc="1" locked="0" layoutInCell="0" allowOverlap="1" wp14:anchorId="6D33703B">
               <wp:simplePos x="0" y="0"/>
               <wp:positionH relativeFrom="margin">
                 <wp:align>center</wp:align>
@@ -1377,7 +1295,7 @@
         </mc:Choice>
         <mc:Fallback>
           <w:pict>
-            <v:rect id="shape_0" stroked="f" o:allowincell="f" style="position:absolute;margin-left:180.95pt;margin-top:-18.15pt;width:539.4pt;height:539.4pt;mso-wrap-style:square;v-text-anchor:middle;rotation:315;mso-position-horizontal:center;mso-position-horizontal-relative:margin;mso-position-vertical:center;mso-position-vertical-relative:margin" wp14:anchorId="6D33703B">
+            <v:rect id="shape_0" stroked="f" o:allowincell="f" style="position:absolute;margin-left:0pt;margin-top:-0.05pt;width:539.4pt;height:539.4pt;mso-wrap-style:square;v-text-anchor:middle;rotation:315;mso-position-horizontal:center;mso-position-horizontal-relative:margin;mso-position-vertical:center;mso-position-vertical-relative:margin" wp14:anchorId="6D33703B">
               <v:fill o:detectmouseclick="t" on="false"/>
               <v:stroke color="#3465a4" joinstyle="round" endcap="flat"/>
               <v:textbox>
@@ -1413,7 +1331,6 @@
   <w:p>
     <w:pPr>
       <w:pStyle w:val="Normal"/>
-      <w:pBdr/>
       <w:tabs>
         <w:tab w:val="clear" w:pos="720"/>
         <w:tab w:val="center" w:pos="4680" w:leader="none"/>
@@ -1496,7 +1413,6 @@
   <w:p>
     <w:pPr>
       <w:pStyle w:val="Normal"/>
-      <w:pBdr/>
       <w:tabs>
         <w:tab w:val="clear" w:pos="720"/>
         <w:tab w:val="center" w:pos="4680" w:leader="none"/>
@@ -1523,7 +1439,6 @@
   <w:p>
     <w:pPr>
       <w:pStyle w:val="Normal"/>
-      <w:pBdr/>
       <w:tabs>
         <w:tab w:val="clear" w:pos="720"/>
         <w:tab w:val="center" w:pos="4680" w:leader="none"/>
@@ -2492,6 +2407,7 @@
     <w:rsid w:val="001044bd"/>
     <w:pPr>
       <w:widowControl/>
+      <w:suppressAutoHyphens w:val="true"/>
       <w:bidi w:val="0"/>
       <w:spacing w:before="0" w:after="0"/>
       <w:jc w:val="start"/>
@@ -2942,12 +2858,13 @@
     <w:rsid w:val="007e7e47"/>
     <w:pPr>
       <w:widowControl/>
+      <w:suppressAutoHyphens w:val="true"/>
       <w:bidi w:val="0"/>
       <w:spacing w:before="0" w:after="0"/>
       <w:jc w:val="start"/>
     </w:pPr>
     <w:rPr>
-      <w:rFonts w:eastAsia="" w:eastAsiaTheme="minorEastAsia" w:ascii="Calibri" w:hAnsi="Calibri" w:cs="Calibri"/>
+      <w:rFonts w:ascii="Calibri" w:hAnsi="Calibri" w:eastAsia="" w:cs="Calibri" w:eastAsiaTheme="minorEastAsia"/>
       <w:color w:val="auto"/>
       <w:kern w:val="0"/>
       <w:sz w:val="24"/>
@@ -3006,6 +2923,13 @@
   </w:style>
   <w:style w:type="paragraph" w:styleId="FrameContents">
     <w:name w:val="Frame Contents"/>
+    <w:basedOn w:val="Normal"/>
+    <w:qFormat/>
+    <w:pPr/>
+    <w:rPr/>
+  </w:style>
+  <w:style w:type="paragraph" w:styleId="FrameContentsuser">
+    <w:name w:val="Frame Contents (user)"/>
     <w:basedOn w:val="Normal"/>
     <w:qFormat/>
     <w:pPr/>

</xml_diff>